<commit_message>
Add technical framing, training pipeline, and tech stack sections to Q&A guide
Three new sections addressing gaps flagged before the presentation:
1. What This Project Is — technical framing (cross-silo FL vs distributed
   training, the Ghana DPA 2012 systems constraint, concrete education-system
   impact tied to SDG 4/16) instead of the plain-language framing used before
2. Model Training Pipeline — full technical answer to "what did you use to
   train the model": architecture, BCEWithLogitsLoss, Adam, FedAvg's delta
   computation, and the DP-SGD mechanics (GradSampleModule, per-sample
   clipping, Gaussian mechanism, RDP accountant) in proper terminology
3. Technology Stack — frontend/backend breakdown with justification for each
   choice (Flower/PyTorch/Opacus/Paillier/FastAPI/SQLite backend; React/Vite/
   Chart.js frontend), plus the gRPC-vs-REST protocol split

Updated in both the published HTML artifact (same URL) and the Word export.
</commit_message>
<xml_diff>
--- a/FL_Ghana_Defense_QA_Study_Guide.docx
+++ b/FL_Ghana_Defense_QA_Study_Guide.docx
@@ -78,7 +78,266 @@
           <w:color w:val="0F3460"/>
           <w:sz w:val="34"/>
         </w:rPr>
-        <w:t>1.  The Dataset (OULAD)</w:t>
+        <w:t>1.  What This Project Is — Technical Framing</w:t>
+      </w:r>
+    </w:p>
+    <w:p>
+      <w:pPr>
+        <w:spacing w:after="200"/>
+      </w:pPr>
+      <w:r>
+        <w:rPr>
+          <w:i/>
+          <w:color w:val="6B7280"/>
+          <w:sz w:val="20"/>
+        </w:rPr>
+        <w:t>Say this first if asked to summarise the project — it's precise, not just descriptive.</w:t>
+      </w:r>
+    </w:p>
+    <w:tbl>
+      <w:tblPr>
+        <w:tblW w:type="auto" w:w="0"/>
+        <w:jc w:val="center"/>
+        <w:tblLook w:firstColumn="1" w:firstRow="1" w:lastColumn="0" w:lastRow="0" w:noHBand="0" w:noVBand="1" w:val="04A0"/>
+      </w:tblPr>
+      <w:tblGrid>
+        <w:gridCol w:w="9746"/>
+      </w:tblGrid>
+      <w:tr>
+        <w:tc>
+          <w:tcPr>
+            <w:tcW w:type="dxa" w:w="9746"/>
+            <w:shd w:val="clear" w:color="auto" w:fill="F8F9FF"/>
+            <w:tcBorders>
+              <w:left w:val="single" w:sz="28" w:color="6366F1"/>
+            </w:tcBorders>
+          </w:tcPr>
+          <w:p>
+            <w:pPr>
+              <w:spacing w:after="80"/>
+            </w:pPr>
+            <w:r>
+              <w:rPr>
+                <w:b/>
+                <w:color w:val="4F46E5"/>
+                <w:sz w:val="23"/>
+              </w:rPr>
+              <w:t>Q  In one technically precise sentence, what is this project?</w:t>
+            </w:r>
+          </w:p>
+          <w:p>
+            <w:pPr>
+              <w:spacing w:before="80" w:after="40"/>
+            </w:pPr>
+            <w:r>
+              <w:rPr>
+                <w:color w:val="333333"/>
+                <w:sz w:val="21"/>
+              </w:rPr>
+              <w:t>A cross-silo federated learning system that trains a shared binary classifier for student at-risk prediction across multiple data-owning institutions (simulated schools), using FedAvg for parameter aggregation, DP-SGD for a formal per-round privacy guarantee, and Paillier partial homomorphic encryption for secure aggregation — so no institution's raw data or unencrypted model update ever leaves its own boundary.</w:t>
+            </w:r>
+          </w:p>
+        </w:tc>
+      </w:tr>
+    </w:tbl>
+    <w:p>
+      <w:pPr>
+        <w:spacing w:after="40"/>
+      </w:pPr>
+    </w:p>
+    <w:tbl>
+      <w:tblPr>
+        <w:tblW w:type="auto" w:w="0"/>
+        <w:jc w:val="center"/>
+        <w:tblLook w:firstColumn="1" w:firstRow="1" w:lastColumn="0" w:lastRow="0" w:noHBand="0" w:noVBand="1" w:val="04A0"/>
+      </w:tblPr>
+      <w:tblGrid>
+        <w:gridCol w:w="9746"/>
+      </w:tblGrid>
+      <w:tr>
+        <w:tc>
+          <w:tcPr>
+            <w:tcW w:type="dxa" w:w="9746"/>
+            <w:shd w:val="clear" w:color="auto" w:fill="F8F9FF"/>
+            <w:tcBorders>
+              <w:left w:val="single" w:sz="28" w:color="6366F1"/>
+            </w:tcBorders>
+          </w:tcPr>
+          <w:p>
+            <w:pPr>
+              <w:spacing w:after="80"/>
+            </w:pPr>
+            <w:r>
+              <w:rPr>
+                <w:b/>
+                <w:color w:val="4F46E5"/>
+                <w:sz w:val="23"/>
+              </w:rPr>
+              <w:t>Q  What makes this "federated learning" specifically, and not just "distributed training"?</w:t>
+            </w:r>
+          </w:p>
+          <w:p>
+            <w:pPr>
+              <w:spacing w:before="80" w:after="40"/>
+            </w:pPr>
+            <w:r>
+              <w:rPr>
+                <w:color w:val="333333"/>
+                <w:sz w:val="21"/>
+              </w:rPr>
+              <w:t>Distributed training (e.g. multi-GPU data-parallel training) assumes the orchestrator can see and shuffle the data across workers freely — the data is centrally owned, just physically spread out for speed. Federated learning assumes the opposite: each participant's data is privately owned, non-IID (school_gamma is 57% at-risk, school_beta is 49%), and must never leave that participant's boundary.</w:t>
+            </w:r>
+          </w:p>
+          <w:p>
+            <w:pPr>
+              <w:spacing w:before="120" w:after="40"/>
+            </w:pPr>
+            <w:r>
+              <w:rPr>
+                <w:color w:val="333333"/>
+                <w:sz w:val="21"/>
+              </w:rPr>
+              <w:t>We're specifically doing cross-silo FL — a small number (3-5) of reliable, always-available institutional participants — as opposed to cross-device FL (Google's original use case: millions of unreliable mobile phones). Cross-silo FL is why we can afford synchronous rounds and don't need client-selection sampling strategies designed for device churn.</w:t>
+            </w:r>
+          </w:p>
+        </w:tc>
+      </w:tr>
+    </w:tbl>
+    <w:p>
+      <w:pPr>
+        <w:spacing w:after="40"/>
+      </w:pPr>
+    </w:p>
+    <w:tbl>
+      <w:tblPr>
+        <w:tblW w:type="auto" w:w="0"/>
+        <w:jc w:val="center"/>
+        <w:tblLook w:firstColumn="1" w:firstRow="1" w:lastColumn="0" w:lastRow="0" w:noHBand="0" w:noVBand="1" w:val="04A0"/>
+      </w:tblPr>
+      <w:tblGrid>
+        <w:gridCol w:w="9746"/>
+      </w:tblGrid>
+      <w:tr>
+        <w:tc>
+          <w:tcPr>
+            <w:tcW w:type="dxa" w:w="9746"/>
+            <w:shd w:val="clear" w:color="auto" w:fill="F8F9FF"/>
+            <w:tcBorders>
+              <w:left w:val="single" w:sz="28" w:color="6366F1"/>
+            </w:tcBorders>
+          </w:tcPr>
+          <w:p>
+            <w:pPr>
+              <w:spacing w:after="80"/>
+            </w:pPr>
+            <w:r>
+              <w:rPr>
+                <w:b/>
+                <w:color w:val="4F46E5"/>
+                <w:sz w:val="23"/>
+              </w:rPr>
+              <w:t>Q  What's the underlying systems constraint that makes FL the right architecture here, not just a stylistic choice?</w:t>
+            </w:r>
+          </w:p>
+          <w:p>
+            <w:pPr>
+              <w:spacing w:before="80" w:after="40"/>
+            </w:pPr>
+            <w:r>
+              <w:rPr>
+                <w:color w:val="333333"/>
+                <w:sz w:val="21"/>
+              </w:rPr>
+              <w:t>Data sovereignty, enforced legally: the Ghana Data Protection Act 2012 (Act 843) prohibits transfer of personal data — including academic records — between institutions without explicit consent and adequate security measures. That means centralised training is not just undesirable but legally infeasible. FL is the systems-level solution because it achieves the same ML objective — one globally-optimised shared model — under a hard data-locality constraint the centralised approach cannot satisfy.</w:t>
+            </w:r>
+          </w:p>
+        </w:tc>
+      </w:tr>
+    </w:tbl>
+    <w:p>
+      <w:pPr>
+        <w:spacing w:after="40"/>
+      </w:pPr>
+    </w:p>
+    <w:tbl>
+      <w:tblPr>
+        <w:tblW w:type="auto" w:w="0"/>
+        <w:jc w:val="center"/>
+        <w:tblLook w:firstColumn="1" w:firstRow="1" w:lastColumn="0" w:lastRow="0" w:noHBand="0" w:noVBand="1" w:val="04A0"/>
+      </w:tblPr>
+      <w:tblGrid>
+        <w:gridCol w:w="9746"/>
+      </w:tblGrid>
+      <w:tr>
+        <w:tc>
+          <w:tcPr>
+            <w:tcW w:type="dxa" w:w="9746"/>
+            <w:shd w:val="clear" w:color="auto" w:fill="F8F9FF"/>
+            <w:tcBorders>
+              <w:left w:val="single" w:sz="28" w:color="6366F1"/>
+            </w:tcBorders>
+          </w:tcPr>
+          <w:p>
+            <w:pPr>
+              <w:spacing w:after="80"/>
+            </w:pPr>
+            <w:r>
+              <w:rPr>
+                <w:b/>
+                <w:color w:val="4F46E5"/>
+                <w:sz w:val="23"/>
+              </w:rPr>
+              <w:t>Q  How does this actually improve the education system — concretely, not just "it helps"?</w:t>
+            </w:r>
+          </w:p>
+          <w:p>
+            <w:pPr>
+              <w:spacing w:before="80" w:after="40"/>
+            </w:pPr>
+            <w:r>
+              <w:rPr>
+                <w:color w:val="333333"/>
+                <w:sz w:val="21"/>
+              </w:rPr>
+              <w:t>Three concrete mechanisms: (1) Early-warning capability without new data infrastructure — district education offices get a shared predictive signal across their schools without GES needing to build or fund a centralised student-records database. (2) Legal compliance is structural, not procedural — privacy isn't a policy added after the fact, it's enforced by the architecture itself (DP-SGD's formal (ε,δ) guarantee, Paillier's cryptographic guarantee).</w:t>
+            </w:r>
+          </w:p>
+          <w:p>
+            <w:pPr>
+              <w:spacing w:before="120" w:after="40"/>
+            </w:pPr>
+            <w:r>
+              <w:rPr>
+                <w:color w:val="333333"/>
+                <w:sz w:val="21"/>
+              </w:rPr>
+              <w:t>(3) The architecture generalises beyond education — the same FL + DP-SGD + partial-homomorphic-secure-aggregation stack applies to any regulated, multi-institutional setting where data can't be centralised: hospital consortia training diagnostic models, banks doing joint fraud detection, inter-agency government analytics. This maps to SDG 4 (Quality Education, Target 4.1) and SDG 16 (Target 16.10) directly.</w:t>
+            </w:r>
+          </w:p>
+        </w:tc>
+      </w:tr>
+    </w:tbl>
+    <w:p>
+      <w:pPr>
+        <w:spacing w:after="40"/>
+      </w:pPr>
+    </w:p>
+    <w:p>
+      <w:r>
+        <w:br w:type="page"/>
+      </w:r>
+    </w:p>
+    <w:p>
+      <w:pPr>
+        <w:pStyle w:val="Heading1"/>
+        <w:spacing w:before="120"/>
+      </w:pPr>
+      <w:r>
+        <w:rPr>
+          <w:color w:val="0F3460"/>
+          <w:sz w:val="34"/>
+        </w:rPr>
+        <w:t>2.  The Dataset (OULAD)</w:t>
       </w:r>
     </w:p>
     <w:p>
@@ -410,7 +669,824 @@
           <w:color w:val="0F3460"/>
           <w:sz w:val="34"/>
         </w:rPr>
-        <w:t>2.  Privacy Design — DP-SGD + Paillier</w:t>
+        <w:t>3.  Model Training Pipeline</w:t>
+      </w:r>
+    </w:p>
+    <w:p>
+      <w:pPr>
+        <w:spacing w:after="200"/>
+      </w:pPr>
+      <w:r>
+        <w:rPr>
+          <w:i/>
+          <w:color w:val="6B7280"/>
+          <w:sz w:val="20"/>
+        </w:rPr>
+        <w:t>The full, precise answer to "what did you use to train the model" — walk through this layer by layer.</w:t>
+      </w:r>
+    </w:p>
+    <w:tbl>
+      <w:tblPr>
+        <w:tblW w:type="auto" w:w="0"/>
+        <w:jc w:val="center"/>
+        <w:tblLook w:firstColumn="1" w:firstRow="1" w:lastColumn="0" w:lastRow="0" w:noHBand="0" w:noVBand="1" w:val="04A0"/>
+      </w:tblPr>
+      <w:tblGrid>
+        <w:gridCol w:w="9746"/>
+      </w:tblGrid>
+      <w:tr>
+        <w:tc>
+          <w:tcPr>
+            <w:tcW w:type="dxa" w:w="9746"/>
+            <w:shd w:val="clear" w:color="auto" w:fill="F8F9FF"/>
+            <w:tcBorders>
+              <w:left w:val="single" w:sz="28" w:color="6366F1"/>
+            </w:tcBorders>
+          </w:tcPr>
+          <w:p>
+            <w:pPr>
+              <w:spacing w:after="80"/>
+            </w:pPr>
+            <w:r>
+              <w:rPr>
+                <w:b/>
+                <w:color w:val="4F46E5"/>
+                <w:sz w:val="23"/>
+              </w:rPr>
+              <w:t>Q  What did you use to train the model — full technical answer?</w:t>
+            </w:r>
+          </w:p>
+          <w:p>
+            <w:pPr>
+              <w:spacing w:before="80" w:after="40"/>
+            </w:pPr>
+            <w:r>
+              <w:rPr>
+                <w:color w:val="333333"/>
+                <w:sz w:val="21"/>
+              </w:rPr>
+              <w:t>Architecture: a fully-connected feedforward network (StudentMLP in PyTorch) — Linear(8-&gt;64) -&gt; ReLU -&gt; Linear(64-&gt;32) -&gt; ReLU -&gt; Linear(32-&gt;1), emitting a raw logit. 2,689 trainable parameters total.</w:t>
+            </w:r>
+          </w:p>
+          <w:p>
+            <w:pPr>
+              <w:spacing w:before="120" w:after="40"/>
+            </w:pPr>
+            <w:r>
+              <w:rPr>
+                <w:color w:val="333333"/>
+                <w:sz w:val="21"/>
+              </w:rPr>
+              <w:t>Loss: BCEWithLogitsLoss — combines sigmoid activation and binary cross-entropy into one numerically stable log-sum-exp computation, avoiding the float overflow/underflow a separate sigmoid-then-BCELoss pipeline risks. A pos_weight term (derived from each partition's class-imbalance ratio, capped at 10x) penalises missed at-risk predictions more heavily than false positives.</w:t>
+            </w:r>
+          </w:p>
+          <w:p>
+            <w:pPr>
+              <w:spacing w:before="120" w:after="40"/>
+            </w:pPr>
+            <w:r>
+              <w:rPr>
+                <w:color w:val="333333"/>
+                <w:sz w:val="21"/>
+              </w:rPr>
+              <w:t>Optimiser: Adam, learning rate 0.01, default beta coefficients — re-instantiated fresh each round per client (no persisted optimiser state across rounds, the standard FedAvg assumption).</w:t>
+            </w:r>
+          </w:p>
+          <w:p>
+            <w:pPr>
+              <w:spacing w:before="120" w:after="40"/>
+            </w:pPr>
+            <w:r>
+              <w:rPr>
+                <w:color w:val="333333"/>
+                <w:sz w:val="21"/>
+              </w:rPr>
+              <w:t>Local training loop: 3 local epochs per communication round, mini-batch SGD via Adam, batch size 32, executed entirely client-side on that school's own data only.</w:t>
+            </w:r>
+          </w:p>
+          <w:p>
+            <w:pPr>
+              <w:spacing w:before="120" w:after="40"/>
+            </w:pPr>
+            <w:r>
+              <w:rPr>
+                <w:color w:val="333333"/>
+                <w:sz w:val="21"/>
+              </w:rPr>
+              <w:t>Aggregation: FedAvg. Each client computes a parameter delta dw_i = w_i(local) - w(global), the server computes the weighted mean dw = sum((n_i/N) * dw_i) where n_i is client i's sample count, and updates w(global) &lt;- w(global) + dw.</w:t>
+            </w:r>
+          </w:p>
+        </w:tc>
+      </w:tr>
+    </w:tbl>
+    <w:p>
+      <w:pPr>
+        <w:spacing w:after="40"/>
+      </w:pPr>
+    </w:p>
+    <w:tbl>
+      <w:tblPr>
+        <w:tblW w:type="auto" w:w="0"/>
+        <w:jc w:val="center"/>
+        <w:tblLook w:firstColumn="1" w:firstRow="1" w:lastColumn="0" w:lastRow="0" w:noHBand="0" w:noVBand="1" w:val="04A0"/>
+      </w:tblPr>
+      <w:tblGrid>
+        <w:gridCol w:w="9746"/>
+      </w:tblGrid>
+      <w:tr>
+        <w:tc>
+          <w:tcPr>
+            <w:tcW w:type="dxa" w:w="9746"/>
+            <w:shd w:val="clear" w:color="auto" w:fill="F8F9FF"/>
+            <w:tcBorders>
+              <w:left w:val="single" w:sz="28" w:color="6366F1"/>
+            </w:tcBorders>
+          </w:tcPr>
+          <w:p>
+            <w:pPr>
+              <w:spacing w:after="80"/>
+            </w:pPr>
+            <w:r>
+              <w:rPr>
+                <w:b/>
+                <w:color w:val="4F46E5"/>
+                <w:sz w:val="23"/>
+              </w:rPr>
+              <w:t>Q  Walk through exactly how DP-SGD modifies that training loop, mechanically.</w:t>
+            </w:r>
+          </w:p>
+          <w:p>
+            <w:pPr>
+              <w:spacing w:before="80" w:after="40"/>
+            </w:pPr>
+            <w:r>
+              <w:rPr>
+                <w:color w:val="333333"/>
+                <w:sz w:val="21"/>
+              </w:rPr>
+              <w:t>Opacus wraps the model in a GradSampleModule, which hooks the backward pass to materialise per-sample gradients (via a vectorised Jacobian technique) instead of the batch-averaged gradient PyTorch computes by default. Each per-sample gradient is clipped to L2 norm &lt;= C (C=1.0), Gaussian noise sampled from N(0, sigma^2*C^2*I) is added to the clipped sum (sigma=1.1), and the noisy sum is averaged before the optimiser step.</w:t>
+            </w:r>
+          </w:p>
+          <w:p>
+            <w:pPr>
+              <w:spacing w:before="120" w:after="40"/>
+            </w:pPr>
+            <w:r>
+              <w:rPr>
+                <w:color w:val="333333"/>
+                <w:sz w:val="21"/>
+              </w:rPr>
+              <w:t>Privacy loss is tracked with a Renyi Differential Privacy (RDP) accountant, which composes the per-step privacy cost across all steps in a round and converts to a reportable (epsilon, delta)-DP guarantee (delta fixed at 1e-5, epsilon computed empirically via get_privacy_spent()).</w:t>
+            </w:r>
+          </w:p>
+        </w:tc>
+      </w:tr>
+    </w:tbl>
+    <w:p>
+      <w:pPr>
+        <w:spacing w:after="40"/>
+      </w:pPr>
+    </w:p>
+    <w:tbl>
+      <w:tblPr>
+        <w:tblW w:type="auto" w:w="0"/>
+        <w:jc w:val="center"/>
+        <w:tblLook w:firstColumn="1" w:firstRow="1" w:lastColumn="0" w:lastRow="0" w:noHBand="0" w:noVBand="1" w:val="04A0"/>
+      </w:tblPr>
+      <w:tblGrid>
+        <w:gridCol w:w="9746"/>
+      </w:tblGrid>
+      <w:tr>
+        <w:tc>
+          <w:tcPr>
+            <w:tcW w:type="dxa" w:w="9746"/>
+            <w:shd w:val="clear" w:color="auto" w:fill="F8F9FF"/>
+            <w:tcBorders>
+              <w:left w:val="single" w:sz="28" w:color="6366F1"/>
+            </w:tcBorders>
+          </w:tcPr>
+          <w:p>
+            <w:pPr>
+              <w:spacing w:after="80"/>
+            </w:pPr>
+            <w:r>
+              <w:rPr>
+                <w:b/>
+                <w:color w:val="4F46E5"/>
+                <w:sz w:val="23"/>
+              </w:rPr>
+              <w:t>Q  Where does encryption fit relative to training — before, during, or after?</w:t>
+            </w:r>
+          </w:p>
+          <w:p>
+            <w:pPr>
+              <w:spacing w:before="80" w:after="40"/>
+            </w:pPr>
+            <w:r>
+              <w:rPr>
+                <w:color w:val="333333"/>
+                <w:sz w:val="21"/>
+              </w:rPr>
+              <w:t>Strictly after. Training (including DP-SGD's clipping and noise injection) happens entirely in plaintext, locally, inside PyTorch. Only once the final parameter delta for that round is computed does it get Paillier-encrypted, element-wise, immediately before serialisation and network transmission.</w:t>
+            </w:r>
+          </w:p>
+        </w:tc>
+      </w:tr>
+    </w:tbl>
+    <w:p>
+      <w:pPr>
+        <w:spacing w:after="40"/>
+      </w:pPr>
+    </w:p>
+    <w:p>
+      <w:r>
+        <w:br w:type="page"/>
+      </w:r>
+    </w:p>
+    <w:p>
+      <w:pPr>
+        <w:pStyle w:val="Heading1"/>
+        <w:spacing w:before="120"/>
+      </w:pPr>
+      <w:r>
+        <w:rPr>
+          <w:color w:val="0F3460"/>
+          <w:sz w:val="34"/>
+        </w:rPr>
+        <w:t>4.  Technology Stack — Frontend &amp; Backend</w:t>
+      </w:r>
+    </w:p>
+    <w:p>
+      <w:pPr>
+        <w:spacing w:after="200"/>
+      </w:pPr>
+      <w:r>
+        <w:rPr>
+          <w:i/>
+          <w:color w:val="6B7280"/>
+          <w:sz w:val="20"/>
+        </w:rPr>
+        <w:t>Name the library, know why it was chosen — that combination is what reads as technical fluency.</w:t>
+      </w:r>
+    </w:p>
+    <w:p>
+      <w:pPr>
+        <w:spacing w:before="120" w:after="80"/>
+      </w:pPr>
+      <w:r>
+        <w:rPr>
+          <w:b/>
+          <w:color w:val="4F46E5"/>
+          <w:sz w:val="20"/>
+        </w:rPr>
+        <w:t>BACKEND</w:t>
+      </w:r>
+    </w:p>
+    <w:tbl>
+      <w:tblPr>
+        <w:tblStyle w:val="LightGrid-Accent1"/>
+        <w:tblW w:type="auto" w:w="0"/>
+        <w:tblLook w:firstColumn="1" w:firstRow="1" w:lastColumn="0" w:lastRow="0" w:noHBand="0" w:noVBand="1" w:val="04A0"/>
+      </w:tblPr>
+      <w:tblGrid>
+        <w:gridCol w:w="4873"/>
+        <w:gridCol w:w="4873"/>
+      </w:tblGrid>
+      <w:tr>
+        <w:tc>
+          <w:tcPr>
+            <w:tcW w:type="dxa" w:w="4873"/>
+          </w:tcPr>
+          <w:p>
+            <w:r>
+              <w:rPr>
+                <w:b/>
+                <w:sz w:val="19"/>
+              </w:rPr>
+              <w:t>Component</w:t>
+            </w:r>
+          </w:p>
+        </w:tc>
+        <w:tc>
+          <w:tcPr>
+            <w:tcW w:type="dxa" w:w="4873"/>
+          </w:tcPr>
+          <w:p>
+            <w:r>
+              <w:rPr>
+                <w:b/>
+                <w:sz w:val="19"/>
+              </w:rPr>
+              <w:t>Role &amp; why it was chosen</w:t>
+            </w:r>
+          </w:p>
+        </w:tc>
+      </w:tr>
+      <w:tr>
+        <w:tc>
+          <w:tcPr>
+            <w:tcW w:type="dxa" w:w="4873"/>
+          </w:tcPr>
+          <w:p>
+            <w:r>
+              <w:rPr>
+                <w:b/>
+                <w:color w:val="0F3460"/>
+                <w:sz w:val="19"/>
+              </w:rPr>
+              <w:t>Python 3.11.9</w:t>
+            </w:r>
+          </w:p>
+        </w:tc>
+        <w:tc>
+          <w:tcPr>
+            <w:tcW w:type="dxa" w:w="4873"/>
+          </w:tcPr>
+          <w:p>
+            <w:r>
+              <w:rPr>
+                <w:sz w:val="19"/>
+              </w:rPr>
+              <w:t>Pinned specifically for Opacus 1.4.0 compatibility</w:t>
+            </w:r>
+          </w:p>
+        </w:tc>
+      </w:tr>
+      <w:tr>
+        <w:tc>
+          <w:tcPr>
+            <w:tcW w:type="dxa" w:w="4873"/>
+          </w:tcPr>
+          <w:p>
+            <w:r>
+              <w:rPr>
+                <w:b/>
+                <w:color w:val="0F3460"/>
+                <w:sz w:val="19"/>
+              </w:rPr>
+              <w:t>Flower 1.8.0</w:t>
+            </w:r>
+          </w:p>
+        </w:tc>
+        <w:tc>
+          <w:tcPr>
+            <w:tcW w:type="dxa" w:w="4873"/>
+          </w:tcPr>
+          <w:p>
+            <w:r>
+              <w:rPr>
+                <w:sz w:val="19"/>
+              </w:rPr>
+              <w:t>gRPC-based FL orchestration framework — provides ClientManager, the Strategy abstraction (overridden as PaillierFedAvg), and the round-scheduling state machine</w:t>
+            </w:r>
+          </w:p>
+        </w:tc>
+      </w:tr>
+      <w:tr>
+        <w:tc>
+          <w:tcPr>
+            <w:tcW w:type="dxa" w:w="4873"/>
+          </w:tcPr>
+          <w:p>
+            <w:r>
+              <w:rPr>
+                <w:b/>
+                <w:color w:val="0F3460"/>
+                <w:sz w:val="19"/>
+              </w:rPr>
+              <w:t>PyTorch 2.3.0</w:t>
+            </w:r>
+          </w:p>
+        </w:tc>
+        <w:tc>
+          <w:tcPr>
+            <w:tcW w:type="dxa" w:w="4873"/>
+          </w:tcPr>
+          <w:p>
+            <w:r>
+              <w:rPr>
+                <w:sz w:val="19"/>
+              </w:rPr>
+              <w:t>Tensor/autograd engine for the MLP; integrates natively with Opacus</w:t>
+            </w:r>
+          </w:p>
+        </w:tc>
+      </w:tr>
+      <w:tr>
+        <w:tc>
+          <w:tcPr>
+            <w:tcW w:type="dxa" w:w="4873"/>
+          </w:tcPr>
+          <w:p>
+            <w:r>
+              <w:rPr>
+                <w:b/>
+                <w:color w:val="0F3460"/>
+                <w:sz w:val="19"/>
+              </w:rPr>
+              <w:t>Opacus 1.4.0</w:t>
+            </w:r>
+          </w:p>
+        </w:tc>
+        <w:tc>
+          <w:tcPr>
+            <w:tcW w:type="dxa" w:w="4873"/>
+          </w:tcPr>
+          <w:p>
+            <w:r>
+              <w:rPr>
+                <w:sz w:val="19"/>
+              </w:rPr>
+              <w:t>DP-SGD instrumentation — GradSampleModule + RDP accountant</w:t>
+            </w:r>
+          </w:p>
+        </w:tc>
+      </w:tr>
+      <w:tr>
+        <w:tc>
+          <w:tcPr>
+            <w:tcW w:type="dxa" w:w="4873"/>
+          </w:tcPr>
+          <w:p>
+            <w:r>
+              <w:rPr>
+                <w:b/>
+                <w:color w:val="0F3460"/>
+                <w:sz w:val="19"/>
+              </w:rPr>
+              <w:t>python-paillier (phe) 1.5.0</w:t>
+            </w:r>
+          </w:p>
+        </w:tc>
+        <w:tc>
+          <w:tcPr>
+            <w:tcW w:type="dxa" w:w="4873"/>
+          </w:tcPr>
+          <w:p>
+            <w:r>
+              <w:rPr>
+                <w:sz w:val="19"/>
+              </w:rPr>
+              <w:t>Paillier partial homomorphic cryptosystem implementation (2048-bit modulus)</w:t>
+            </w:r>
+          </w:p>
+        </w:tc>
+      </w:tr>
+      <w:tr>
+        <w:tc>
+          <w:tcPr>
+            <w:tcW w:type="dxa" w:w="4873"/>
+          </w:tcPr>
+          <w:p>
+            <w:r>
+              <w:rPr>
+                <w:b/>
+                <w:color w:val="0F3460"/>
+                <w:sz w:val="19"/>
+              </w:rPr>
+              <w:t>FastAPI 0.111.0</w:t>
+            </w:r>
+          </w:p>
+        </w:tc>
+        <w:tc>
+          <w:tcPr>
+            <w:tcW w:type="dxa" w:w="4873"/>
+          </w:tcPr>
+          <w:p>
+            <w:r>
+              <w:rPr>
+                <w:sz w:val="19"/>
+              </w:rPr>
+              <w:t>ASGI-based async REST API — serves /api/*, runs the FL simulation as a background task</w:t>
+            </w:r>
+          </w:p>
+        </w:tc>
+      </w:tr>
+      <w:tr>
+        <w:tc>
+          <w:tcPr>
+            <w:tcW w:type="dxa" w:w="4873"/>
+          </w:tcPr>
+          <w:p>
+            <w:r>
+              <w:rPr>
+                <w:b/>
+                <w:color w:val="0F3460"/>
+                <w:sz w:val="19"/>
+              </w:rPr>
+              <w:t>SQLite3</w:t>
+            </w:r>
+          </w:p>
+        </w:tc>
+        <w:tc>
+          <w:tcPr>
+            <w:tcW w:type="dxa" w:w="4873"/>
+          </w:tcPr>
+          <w:p>
+            <w:r>
+              <w:rPr>
+                <w:sz w:val="19"/>
+              </w:rPr>
+              <w:t>Embedded, file-based relational store — one file per school partition, so data isolation is enforced at the filesystem level</w:t>
+            </w:r>
+          </w:p>
+        </w:tc>
+      </w:tr>
+      <w:tr>
+        <w:tc>
+          <w:tcPr>
+            <w:tcW w:type="dxa" w:w="4873"/>
+          </w:tcPr>
+          <w:p>
+            <w:r>
+              <w:rPr>
+                <w:b/>
+                <w:color w:val="0F3460"/>
+                <w:sz w:val="19"/>
+              </w:rPr>
+              <w:t>scikit-learn 1.5.0</w:t>
+            </w:r>
+          </w:p>
+        </w:tc>
+        <w:tc>
+          <w:tcPr>
+            <w:tcW w:type="dxa" w:w="4873"/>
+          </w:tcPr>
+          <w:p>
+            <w:r>
+              <w:rPr>
+                <w:sz w:val="19"/>
+              </w:rPr>
+              <w:t>Evaluation metrics — F1, balanced accuracy, AUC-ROC, ROC-curve-derived Youden's J</w:t>
+            </w:r>
+          </w:p>
+        </w:tc>
+      </w:tr>
+      <w:tr>
+        <w:tc>
+          <w:tcPr>
+            <w:tcW w:type="dxa" w:w="4873"/>
+          </w:tcPr>
+          <w:p>
+            <w:r>
+              <w:rPr>
+                <w:b/>
+                <w:color w:val="0F3460"/>
+                <w:sz w:val="19"/>
+              </w:rPr>
+              <w:t>threading (stdlib)</w:t>
+            </w:r>
+          </w:p>
+        </w:tc>
+        <w:tc>
+          <w:tcPr>
+            <w:tcW w:type="dxa" w:w="4873"/>
+          </w:tcPr>
+          <w:p>
+            <w:r>
+              <w:rPr>
+                <w:sz w:val="19"/>
+              </w:rPr>
+              <w:t>The Flower gRPC server and all school clients run as concurrent threads inside one Python process for the simulation</w:t>
+            </w:r>
+          </w:p>
+        </w:tc>
+      </w:tr>
+    </w:tbl>
+    <w:p>
+      <w:pPr>
+        <w:spacing w:after="40"/>
+      </w:pPr>
+    </w:p>
+    <w:p>
+      <w:pPr>
+        <w:spacing w:before="120" w:after="80"/>
+      </w:pPr>
+      <w:r>
+        <w:rPr>
+          <w:b/>
+          <w:color w:val="4F46E5"/>
+          <w:sz w:val="20"/>
+        </w:rPr>
+        <w:t>FRONTEND</w:t>
+      </w:r>
+    </w:p>
+    <w:tbl>
+      <w:tblPr>
+        <w:tblStyle w:val="LightGrid-Accent1"/>
+        <w:tblW w:type="auto" w:w="0"/>
+        <w:tblLook w:firstColumn="1" w:firstRow="1" w:lastColumn="0" w:lastRow="0" w:noHBand="0" w:noVBand="1" w:val="04A0"/>
+      </w:tblPr>
+      <w:tblGrid>
+        <w:gridCol w:w="4873"/>
+        <w:gridCol w:w="4873"/>
+      </w:tblGrid>
+      <w:tr>
+        <w:tc>
+          <w:tcPr>
+            <w:tcW w:type="dxa" w:w="4873"/>
+          </w:tcPr>
+          <w:p>
+            <w:r>
+              <w:rPr>
+                <w:b/>
+                <w:sz w:val="19"/>
+              </w:rPr>
+              <w:t>Component</w:t>
+            </w:r>
+          </w:p>
+        </w:tc>
+        <w:tc>
+          <w:tcPr>
+            <w:tcW w:type="dxa" w:w="4873"/>
+          </w:tcPr>
+          <w:p>
+            <w:r>
+              <w:rPr>
+                <w:b/>
+                <w:sz w:val="19"/>
+              </w:rPr>
+              <w:t>Role &amp; why it was chosen</w:t>
+            </w:r>
+          </w:p>
+        </w:tc>
+      </w:tr>
+      <w:tr>
+        <w:tc>
+          <w:tcPr>
+            <w:tcW w:type="dxa" w:w="4873"/>
+          </w:tcPr>
+          <w:p>
+            <w:r>
+              <w:rPr>
+                <w:b/>
+                <w:color w:val="0F3460"/>
+                <w:sz w:val="19"/>
+              </w:rPr>
+              <w:t>React 18.3.1</w:t>
+            </w:r>
+          </w:p>
+        </w:tc>
+        <w:tc>
+          <w:tcPr>
+            <w:tcW w:type="dxa" w:w="4873"/>
+          </w:tcPr>
+          <w:p>
+            <w:r>
+              <w:rPr>
+                <w:sz w:val="19"/>
+              </w:rPr>
+              <w:t>Component-based SPA — functional components with hooks; no external state library needed</w:t>
+            </w:r>
+          </w:p>
+        </w:tc>
+      </w:tr>
+      <w:tr>
+        <w:tc>
+          <w:tcPr>
+            <w:tcW w:type="dxa" w:w="4873"/>
+          </w:tcPr>
+          <w:p>
+            <w:r>
+              <w:rPr>
+                <w:b/>
+                <w:color w:val="0F3460"/>
+                <w:sz w:val="19"/>
+              </w:rPr>
+              <w:t>Vite 5</w:t>
+            </w:r>
+          </w:p>
+        </w:tc>
+        <w:tc>
+          <w:tcPr>
+            <w:tcW w:type="dxa" w:w="4873"/>
+          </w:tcPr>
+          <w:p>
+            <w:r>
+              <w:rPr>
+                <w:sz w:val="19"/>
+              </w:rPr>
+              <w:t>ESBuild-based dev server/bundler — near-instant hot-module-reload</w:t>
+            </w:r>
+          </w:p>
+        </w:tc>
+      </w:tr>
+      <w:tr>
+        <w:tc>
+          <w:tcPr>
+            <w:tcW w:type="dxa" w:w="4873"/>
+          </w:tcPr>
+          <w:p>
+            <w:r>
+              <w:rPr>
+                <w:b/>
+                <w:color w:val="0F3460"/>
+                <w:sz w:val="19"/>
+              </w:rPr>
+              <w:t>Chart.js 4 (react-chartjs-2)</w:t>
+            </w:r>
+          </w:p>
+        </w:tc>
+        <w:tc>
+          <w:tcPr>
+            <w:tcW w:type="dxa" w:w="4873"/>
+          </w:tcPr>
+          <w:p>
+            <w:r>
+              <w:rPr>
+                <w:sz w:val="19"/>
+              </w:rPr>
+              <w:t>Canvas-based (not SVG) charting — chosen for rendering performance on charts that redraw every 3 seconds during a live run</w:t>
+            </w:r>
+          </w:p>
+        </w:tc>
+      </w:tr>
+      <w:tr>
+        <w:tc>
+          <w:tcPr>
+            <w:tcW w:type="dxa" w:w="4873"/>
+          </w:tcPr>
+          <w:p>
+            <w:r>
+              <w:rPr>
+                <w:b/>
+                <w:color w:val="0F3460"/>
+                <w:sz w:val="19"/>
+              </w:rPr>
+              <w:t>CSS Modules</w:t>
+            </w:r>
+          </w:p>
+        </w:tc>
+        <w:tc>
+          <w:tcPr>
+            <w:tcW w:type="dxa" w:w="4873"/>
+          </w:tcPr>
+          <w:p>
+            <w:r>
+              <w:rPr>
+                <w:sz w:val="19"/>
+              </w:rPr>
+              <w:t>Locally-scoped component styling, avoids global CSS namespace collisions</w:t>
+            </w:r>
+          </w:p>
+        </w:tc>
+      </w:tr>
+    </w:tbl>
+    <w:p>
+      <w:pPr>
+        <w:spacing w:after="40"/>
+      </w:pPr>
+    </w:p>
+    <w:tbl>
+      <w:tblPr>
+        <w:tblW w:type="auto" w:w="0"/>
+        <w:tblLook w:firstColumn="1" w:firstRow="1" w:lastColumn="0" w:lastRow="0" w:noHBand="0" w:noVBand="1" w:val="04A0"/>
+      </w:tblPr>
+      <w:tblGrid>
+        <w:gridCol w:w="9746"/>
+      </w:tblGrid>
+      <w:tr>
+        <w:tc>
+          <w:tcPr>
+            <w:tcW w:type="dxa" w:w="9746"/>
+            <w:shd w:val="clear" w:color="auto" w:fill="EFF6FF"/>
+            <w:tcBorders>
+              <w:left w:val="single" w:sz="28" w:color="3B82F6"/>
+            </w:tcBorders>
+          </w:tcPr>
+          <w:p>
+            <w:r>
+              <w:rPr>
+                <w:color w:val="333333"/>
+                <w:sz w:val="20"/>
+              </w:rPr>
+              <w:t>Two distinct network protocols run concurrently: Flower's FL protocol runs over gRPC (binary, HTTP/2-based) on port 8088; the dashboard's API runs over REST/JSON on port 8000. The dashboard polls (fetch() every 3000ms) rather than using WebSockets — a deliberate simplicity/robustness tradeoff, reasonable given FL updates arrive on a round-based cadence (tens of seconds), not sub-second.</w:t>
+            </w:r>
+          </w:p>
+        </w:tc>
+      </w:tr>
+    </w:tbl>
+    <w:p>
+      <w:pPr>
+        <w:spacing w:after="40"/>
+      </w:pPr>
+    </w:p>
+    <w:p>
+      <w:r>
+        <w:br w:type="page"/>
+      </w:r>
+    </w:p>
+    <w:p>
+      <w:pPr>
+        <w:pStyle w:val="Heading1"/>
+        <w:spacing w:before="120"/>
+      </w:pPr>
+      <w:r>
+        <w:rPr>
+          <w:color w:val="0F3460"/>
+          <w:sz w:val="34"/>
+        </w:rPr>
+        <w:t>5.  Privacy Design — DP-SGD + Paillier</w:t>
       </w:r>
     </w:p>
     <w:p>
@@ -810,7 +1886,7 @@
           <w:color w:val="0F3460"/>
           <w:sz w:val="34"/>
         </w:rPr>
-        <w:t>3.  Results &amp; Statistical Proof</w:t>
+        <w:t>6.  Results &amp; Statistical Proof</w:t>
       </w:r>
     </w:p>
     <w:p>
@@ -1142,7 +2218,7 @@
           <w:color w:val="0F3460"/>
           <w:sz w:val="34"/>
         </w:rPr>
-        <w:t>4.  Systems &amp; Architecture</w:t>
+        <w:t>7.  Systems &amp; Architecture</w:t>
       </w:r>
     </w:p>
     <w:p>
@@ -1377,7 +2453,7 @@
           <w:color w:val="0F3460"/>
           <w:sz w:val="34"/>
         </w:rPr>
-        <w:t>5.  Reading the Metrics Right</w:t>
+        <w:t>8.  Reading the Metrics Right</w:t>
       </w:r>
     </w:p>
     <w:p>
@@ -1585,7 +2661,7 @@
           <w:color w:val="0F3460"/>
           <w:sz w:val="34"/>
         </w:rPr>
-        <w:t>6.  Walking Through the Dashboard</w:t>
+        <w:t>9.  Walking Through the Dashboard</w:t>
       </w:r>
     </w:p>
     <w:p>

</xml_diff>

<commit_message>
Simplify Q&A guide language to standard CS vocabulary
The new sections (overview, training pipeline, tech stack) read like a
research paper abstract instead of something a CS student would naturally
say out loud. Rewrote them in plain, standard CS-course terms — still
technically correct (neural network, gradient descent, encryption,
database, framework/library, REST API, gRPC) but dropped the research-paper
density (Renyi accountant, vectorised Jacobian, log-sum-exp formulation,
ASGI, semantic security jargon). Updated in both the HTML artifact (same
URL) and the Word export.
</commit_message>
<xml_diff>
--- a/FL_Ghana_Defense_QA_Study_Guide.docx
+++ b/FL_Ghana_Defense_QA_Study_Guide.docx
@@ -78,7 +78,7 @@
           <w:color w:val="0F3460"/>
           <w:sz w:val="34"/>
         </w:rPr>
-        <w:t>1.  What This Project Is — Technical Framing</w:t>
+        <w:t>1.  What This Project Is</w:t>
       </w:r>
     </w:p>
     <w:p>
@@ -91,7 +91,7 @@
           <w:color w:val="6B7280"/>
           <w:sz w:val="20"/>
         </w:rPr>
-        <w:t>Say this first if asked to summarise the project — it's precise, not just descriptive.</w:t>
+        <w:t>Say this first if asked to summarise the project — plain terms, still technically correct.</w:t>
       </w:r>
     </w:p>
     <w:tbl>
@@ -122,7 +122,7 @@
                 <w:color w:val="4F46E5"/>
                 <w:sz w:val="23"/>
               </w:rPr>
-              <w:t>Q  In one technically precise sentence, what is this project?</w:t>
+              <w:t>Q  In one sentence, what is this project?</w:t>
             </w:r>
           </w:p>
           <w:p>
@@ -134,7 +134,7 @@
                 <w:color w:val="333333"/>
                 <w:sz w:val="21"/>
               </w:rPr>
-              <w:t>A cross-silo federated learning system that trains a shared binary classifier for student at-risk prediction across multiple data-owning institutions (simulated schools), using FedAvg for parameter aggregation, DP-SGD for a formal per-round privacy guarantee, and Paillier partial homomorphic encryption for secure aggregation — so no institution's raw data or unencrypted model update ever leaves its own boundary.</w:t>
+              <w:t>A federated learning system that trains one shared machine learning model to predict at-risk students across multiple schools, using FedAvg to combine each school's updates, DP-SGD to add a privacy guarantee during training, and Paillier encryption to protect each update while it's in transit — so no school's raw data, and no unprotected model update, ever leaves that school.</w:t>
             </w:r>
           </w:p>
         </w:tc>
@@ -173,7 +173,7 @@
                 <w:color w:val="4F46E5"/>
                 <w:sz w:val="23"/>
               </w:rPr>
-              <w:t>Q  What makes this "federated learning" specifically, and not just "distributed training"?</w:t>
+              <w:t>Q  What makes this "federated learning" and not just "distributed training"?</w:t>
             </w:r>
           </w:p>
           <w:p>
@@ -185,7 +185,7 @@
                 <w:color w:val="333333"/>
                 <w:sz w:val="21"/>
               </w:rPr>
-              <w:t>Distributed training (e.g. multi-GPU data-parallel training) assumes the orchestrator can see and shuffle the data across workers freely — the data is centrally owned, just physically spread out for speed. Federated learning assumes the opposite: each participant's data is privately owned, non-IID (school_gamma is 57% at-risk, school_beta is 49%), and must never leave that participant's boundary.</w:t>
+              <w:t>Distributed training just splits one shared dataset across multiple machines to train faster — the data is still all owned and controlled centrally. Federated learning is the opposite case: each school owns its data privately, the data looks different from school to school (school_gamma is 57% at-risk, school_beta is 49% — very different class balance), and the raw data is never allowed to leave that school at all.</w:t>
             </w:r>
           </w:p>
           <w:p>
@@ -197,7 +197,7 @@
                 <w:color w:val="333333"/>
                 <w:sz w:val="21"/>
               </w:rPr>
-              <w:t>We're specifically doing cross-silo FL — a small number (3-5) of reliable, always-available institutional participants — as opposed to cross-device FL (Google's original use case: millions of unreliable mobile phones). Cross-silo FL is why we can afford synchronous rounds and don't need client-selection sampling strategies designed for device churn.</w:t>
+              <w:t>We specifically use what's called cross-silo federated learning — a small number of reliable participants that are always online (our 3-5 schools) — as opposed to cross-device FL (Google's original use case: millions of phones connecting and disconnecting at random). Because our "clients" are reliable schools, not random phones, we can run training in clean, synchronised rounds instead of needing extra logic to handle devices randomly dropping out mid-round.</w:t>
             </w:r>
           </w:p>
         </w:tc>
@@ -236,7 +236,7 @@
                 <w:color w:val="4F46E5"/>
                 <w:sz w:val="23"/>
               </w:rPr>
-              <w:t>Q  What's the underlying systems constraint that makes FL the right architecture here, not just a stylistic choice?</w:t>
+              <w:t>Q  What's the real-world reason federated learning was needed here, not just a design preference?</w:t>
             </w:r>
           </w:p>
           <w:p>
@@ -248,7 +248,7 @@
                 <w:color w:val="333333"/>
                 <w:sz w:val="21"/>
               </w:rPr>
-              <w:t>Data sovereignty, enforced legally: the Ghana Data Protection Act 2012 (Act 843) prohibits transfer of personal data — including academic records — between institutions without explicit consent and adequate security measures. That means centralised training is not just undesirable but legally infeasible. FL is the systems-level solution because it achieves the same ML objective — one globally-optimised shared model — under a hard data-locality constraint the centralised approach cannot satisfy.</w:t>
+              <w:t>A legal one: the Ghana Data Protection Act 2012 doesn't allow schools to send student records to a central server without consent. So training one model on everyone's data pooled together isn't just a bad idea — it's not legally allowed. Federated learning solves this properly: it lets every school contribute to one shared model without any of them ever having to send their students' actual records anywhere.</w:t>
             </w:r>
           </w:p>
         </w:tc>
@@ -299,7 +299,7 @@
                 <w:color w:val="333333"/>
                 <w:sz w:val="21"/>
               </w:rPr>
-              <w:t>Three concrete mechanisms: (1) Early-warning capability without new data infrastructure — district education offices get a shared predictive signal across their schools without GES needing to build or fund a centralised student-records database. (2) Legal compliance is structural, not procedural — privacy isn't a policy added after the fact, it's enforced by the architecture itself (DP-SGD's formal (ε,δ) guarantee, Paillier's cryptographic guarantee).</w:t>
+              <w:t>Three concrete ways: (1) Early-warning system without needing new infrastructure — district education officers get a shared prediction model across all their schools, without GES having to build and fund one big central student-records database, which doesn't exist today. (2) Privacy protection is built into the system, not left to policy — DP-SGD and Paillier encryption make privacy a property of the code itself, so it doesn't depend on an administrator remembering to follow the rules correctly.</w:t>
             </w:r>
           </w:p>
           <w:p>
@@ -311,7 +311,7 @@
                 <w:color w:val="333333"/>
                 <w:sz w:val="21"/>
               </w:rPr>
-              <w:t>(3) The architecture generalises beyond education — the same FL + DP-SGD + partial-homomorphic-secure-aggregation stack applies to any regulated, multi-institutional setting where data can't be centralised: hospital consortia training diagnostic models, banks doing joint fraud detection, inter-agency government analytics. This maps to SDG 4 (Quality Education, Target 4.1) and SDG 16 (Target 16.10) directly.</w:t>
+              <w:t>(3) The same idea works far beyond education — federated learning plus differential privacy plus encryption is a reusable pattern for any situation where multiple organisations want to train one shared model but legally can't pool their data: hospitals, banks, government agencies. That's the bigger contribution — not just one education tool, but a template other regulated sectors could reuse.</w:t>
             </w:r>
           </w:p>
         </w:tc>
@@ -682,7 +682,7 @@
           <w:color w:val="6B7280"/>
           <w:sz w:val="20"/>
         </w:rPr>
-        <w:t>The full, precise answer to "what did you use to train the model" — walk through this layer by layer.</w:t>
+        <w:t>The full answer to "what did you use to train the model" — walk through this layer by layer.</w:t>
       </w:r>
     </w:p>
     <w:tbl>
@@ -713,7 +713,7 @@
                 <w:color w:val="4F46E5"/>
                 <w:sz w:val="23"/>
               </w:rPr>
-              <w:t>Q  What did you use to train the model — full technical answer?</w:t>
+              <w:t>Q  What did you use to train the model?</w:t>
             </w:r>
           </w:p>
           <w:p>
@@ -725,7 +725,7 @@
                 <w:color w:val="333333"/>
                 <w:sz w:val="21"/>
               </w:rPr>
-              <w:t>Architecture: a fully-connected feedforward network (StudentMLP in PyTorch) — Linear(8-&gt;64) -&gt; ReLU -&gt; Linear(64-&gt;32) -&gt; ReLU -&gt; Linear(32-&gt;1), emitting a raw logit. 2,689 trainable parameters total.</w:t>
+              <w:t>Model: a neural network built in PyTorch — 3 layers, going 8 input features -&gt; 64 neurons -&gt; 32 neurons -&gt; 1 output, with ReLU activation on the hidden layers. About 2,689 trainable weights in total — small enough to train quickly on ordinary hardware.</w:t>
             </w:r>
           </w:p>
           <w:p>
@@ -737,7 +737,7 @@
                 <w:color w:val="333333"/>
                 <w:sz w:val="21"/>
               </w:rPr>
-              <w:t>Loss: BCEWithLogitsLoss — combines sigmoid activation and binary cross-entropy into one numerically stable log-sum-exp computation, avoiding the float overflow/underflow a separate sigmoid-then-BCELoss pipeline risks. A pos_weight term (derived from each partition's class-imbalance ratio, capped at 10x) penalises missed at-risk predictions more heavily than false positives.</w:t>
+              <w:t>Loss function: Binary Cross-Entropy (using PyTorch's BCEWithLogitsLoss, which combines the sigmoid step and the loss calculation into one function for numerical stability). We also weight the loss so the model is penalised more for missing an at-risk student than for a false alarm, since at-risk students are the minority class we care most about catching.</w:t>
             </w:r>
           </w:p>
           <w:p>
@@ -749,7 +749,7 @@
                 <w:color w:val="333333"/>
                 <w:sz w:val="21"/>
               </w:rPr>
-              <w:t>Optimiser: Adam, learning rate 0.01, default beta coefficients — re-instantiated fresh each round per client (no persisted optimiser state across rounds, the standard FedAvg assumption).</w:t>
+              <w:t>Optimiser: Adam, a standard gradient descent optimiser, learning rate 0.01.</w:t>
             </w:r>
           </w:p>
           <w:p>
@@ -761,7 +761,7 @@
                 <w:color w:val="333333"/>
                 <w:sz w:val="21"/>
               </w:rPr>
-              <w:t>Local training loop: 3 local epochs per communication round, mini-batch SGD via Adam, batch size 32, executed entirely client-side on that school's own data only.</w:t>
+              <w:t>Local training: each school trains for 3 epochs (full passes over its own data) per round, in batches of 32 students, entirely on its own machine — no other school's data is ever involved.</w:t>
             </w:r>
           </w:p>
           <w:p>
@@ -773,7 +773,7 @@
                 <w:color w:val="333333"/>
                 <w:sz w:val="21"/>
               </w:rPr>
-              <w:t>Aggregation: FedAvg. Each client computes a parameter delta dw_i = w_i(local) - w(global), the server computes the weighted mean dw = sum((n_i/N) * dw_i) where n_i is client i's sample count, and updates w(global) &lt;- w(global) + dw.</w:t>
+              <w:t>Combining the updates (FedAvg): each school sends back the change in its model's weights, not the full weights. The server averages these changes — weighted by how many students each school has — and adds that average onto the shared global model.</w:t>
             </w:r>
           </w:p>
         </w:tc>
@@ -812,7 +812,7 @@
                 <w:color w:val="4F46E5"/>
                 <w:sz w:val="23"/>
               </w:rPr>
-              <w:t>Q  Walk through exactly how DP-SGD modifies that training loop, mechanically.</w:t>
+              <w:t>Q  Walk through how DP-SGD changes that training loop, step by step.</w:t>
             </w:r>
           </w:p>
           <w:p>
@@ -824,7 +824,7 @@
                 <w:color w:val="333333"/>
                 <w:sz w:val="21"/>
               </w:rPr>
-              <w:t>Opacus wraps the model in a GradSampleModule, which hooks the backward pass to materialise per-sample gradients (via a vectorised Jacobian technique) instead of the batch-averaged gradient PyTorch computes by default. Each per-sample gradient is clipped to L2 norm &lt;= C (C=1.0), Gaussian noise sampled from N(0, sigma^2*C^2*I) is added to the clipped sum (sigma=1.1), and the noisy sum is averaged before the optimiser step.</w:t>
+              <w:t>Normal gradient descent computes one averaged gradient per batch. DP-SGD instead computes a separate gradient for every individual student in the batch, clips each one so no single student's gradient can be larger than a fixed size (this stops one student's data from dominating the update), adds random Gaussian noise to the sum, and only then averages and updates the model. The added noise is what gives the formal privacy guarantee — it makes it mathematically hard to tell, from the final model, whether any specific student's data was used.</w:t>
             </w:r>
           </w:p>
           <w:p>
@@ -836,7 +836,7 @@
                 <w:color w:val="333333"/>
                 <w:sz w:val="21"/>
               </w:rPr>
-              <w:t>Privacy loss is tracked with a Renyi Differential Privacy (RDP) accountant, which composes the per-step privacy cost across all steps in a round and converts to a reportable (epsilon, delta)-DP guarantee (delta fixed at 1e-5, epsilon computed empirically via get_privacy_spent()).</w:t>
+              <w:t>We also keep a running total of how much "privacy budget" (epsilon) has been spent, using Opacus's built-in privacy accountant, and report it every round.</w:t>
             </w:r>
           </w:p>
         </w:tc>
@@ -875,7 +875,7 @@
                 <w:color w:val="4F46E5"/>
                 <w:sz w:val="23"/>
               </w:rPr>
-              <w:t>Q  Where does encryption fit relative to training — before, during, or after?</w:t>
+              <w:t>Q  Where does encryption happen relative to training — before, during, or after?</w:t>
             </w:r>
           </w:p>
           <w:p>
@@ -887,7 +887,7 @@
                 <w:color w:val="333333"/>
                 <w:sz w:val="21"/>
               </w:rPr>
-              <w:t>Strictly after. Training (including DP-SGD's clipping and noise injection) happens entirely in plaintext, locally, inside PyTorch. Only once the final parameter delta for that round is computed does it get Paillier-encrypted, element-wise, immediately before serialisation and network transmission.</w:t>
+              <w:t>After. Training — including DP-SGD's clipping and noise — happens normally, in plain numbers, on each school's own computer. Only once a school has its final weight update ready does that update get encrypted with Paillier, right before it's sent over the network. Encryption protects the update in transit; DP-SGD protects the training step itself. Two separate jobs.</w:t>
             </w:r>
           </w:p>
         </w:tc>
@@ -926,7 +926,7 @@
           <w:color w:val="6B7280"/>
           <w:sz w:val="20"/>
         </w:rPr>
-        <w:t>Name the library, know why it was chosen — that combination is what reads as technical fluency.</w:t>
+        <w:t>Name the tool, know why it was chosen — that's what shows real understanding, not the tool name alone.</w:t>
       </w:r>
     </w:p>
     <w:p>
@@ -1007,7 +1007,7 @@
               <w:rPr>
                 <w:sz w:val="19"/>
               </w:rPr>
-              <w:t>Pinned specifically for Opacus 1.4.0 compatibility</w:t>
+              <w:t>The language everything is written in — this version specifically because Opacus (our privacy library) requires it</w:t>
             </w:r>
           </w:p>
         </w:tc>
@@ -1037,7 +1037,7 @@
               <w:rPr>
                 <w:sz w:val="19"/>
               </w:rPr>
-              <w:t>gRPC-based FL orchestration framework — provides ClientManager, the Strategy abstraction (overridden as PaillierFedAvg), and the round-scheduling state machine</w:t>
+              <w:t>The framework that handles federated learning communication — which school talks to the server, when, and in what order — so we didn't have to build that networking logic ourselves</w:t>
             </w:r>
           </w:p>
         </w:tc>
@@ -1067,7 +1067,7 @@
               <w:rPr>
                 <w:sz w:val="19"/>
               </w:rPr>
-              <w:t>Tensor/autograd engine for the MLP; integrates natively with Opacus</w:t>
+              <w:t>The machine learning library used to build and train the neural network</w:t>
             </w:r>
           </w:p>
         </w:tc>
@@ -1097,7 +1097,7 @@
               <w:rPr>
                 <w:sz w:val="19"/>
               </w:rPr>
-              <w:t>DP-SGD instrumentation — GradSampleModule + RDP accountant</w:t>
+              <w:t>Meta's library for adding differential privacy (DP-SGD) to PyTorch training</w:t>
             </w:r>
           </w:p>
         </w:tc>
@@ -1127,7 +1127,7 @@
               <w:rPr>
                 <w:sz w:val="19"/>
               </w:rPr>
-              <w:t>Paillier partial homomorphic cryptosystem implementation (2048-bit modulus)</w:t>
+              <w:t>Implements Paillier encryption — the library that does the actual encrypt/decrypt/add-while-encrypted operations</w:t>
             </w:r>
           </w:p>
         </w:tc>
@@ -1157,7 +1157,7 @@
               <w:rPr>
                 <w:sz w:val="19"/>
               </w:rPr>
-              <w:t>ASGI-based async REST API — serves /api/*, runs the FL simulation as a background task</w:t>
+              <w:t>The web framework serving the dashboard's backend API and running the FL simulation in the background</w:t>
             </w:r>
           </w:p>
         </w:tc>
@@ -1187,7 +1187,7 @@
               <w:rPr>
                 <w:sz w:val="19"/>
               </w:rPr>
-              <w:t>Embedded, file-based relational store — one file per school partition, so data isolation is enforced at the filesystem level</w:t>
+              <w:t>A lightweight database — each school gets its own database file, which is also how we enforce that one school's data can never accidentally end up in another school's file</w:t>
             </w:r>
           </w:p>
         </w:tc>
@@ -1217,7 +1217,7 @@
               <w:rPr>
                 <w:sz w:val="19"/>
               </w:rPr>
-              <w:t>Evaluation metrics — F1, balanced accuracy, AUC-ROC, ROC-curve-derived Youden's J</w:t>
+              <w:t>Used to compute evaluation metrics — F1-score, balanced accuracy, AUC-ROC</w:t>
             </w:r>
           </w:p>
         </w:tc>
@@ -1234,7 +1234,7 @@
                 <w:color w:val="0F3460"/>
                 <w:sz w:val="19"/>
               </w:rPr>
-              <w:t>threading (stdlib)</w:t>
+              <w:t>Python's threading module</w:t>
             </w:r>
           </w:p>
         </w:tc>
@@ -1247,7 +1247,7 @@
               <w:rPr>
                 <w:sz w:val="19"/>
               </w:rPr>
-              <w:t>The Flower gRPC server and all school clients run as concurrent threads inside one Python process for the simulation</w:t>
+              <w:t>Lets the FL server and every school's client run at the same time inside one program, simulating what would normally be separate physical computers</w:t>
             </w:r>
           </w:p>
         </w:tc>
@@ -1336,7 +1336,7 @@
               <w:rPr>
                 <w:sz w:val="19"/>
               </w:rPr>
-              <w:t>Component-based SPA — functional components with hooks; no external state library needed</w:t>
+              <w:t>The JavaScript library used to build the dashboard's user interface out of reusable components</w:t>
             </w:r>
           </w:p>
         </w:tc>
@@ -1366,7 +1366,7 @@
               <w:rPr>
                 <w:sz w:val="19"/>
               </w:rPr>
-              <w:t>ESBuild-based dev server/bundler — near-instant hot-module-reload</w:t>
+              <w:t>Runs the dashboard locally during development and rebuilds it instantly whenever we change the code</w:t>
             </w:r>
           </w:p>
         </w:tc>
@@ -1396,7 +1396,7 @@
               <w:rPr>
                 <w:sz w:val="19"/>
               </w:rPr>
-              <w:t>Canvas-based (not SVG) charting — chosen for rendering performance on charts that redraw every 3 seconds during a live run</w:t>
+              <w:t>The charting library behind every graph on the dashboard</w:t>
             </w:r>
           </w:p>
         </w:tc>
@@ -1426,7 +1426,7 @@
               <w:rPr>
                 <w:sz w:val="19"/>
               </w:rPr>
-              <w:t>Locally-scoped component styling, avoids global CSS namespace collisions</w:t>
+              <w:t>Keeps each component's styling separate, so styles from one part of the page can't accidentally clash with another</w:t>
             </w:r>
           </w:p>
         </w:tc>
@@ -1460,7 +1460,7 @@
                 <w:color w:val="333333"/>
                 <w:sz w:val="20"/>
               </w:rPr>
-              <w:t>Two distinct network protocols run concurrently: Flower's FL protocol runs over gRPC (binary, HTTP/2-based) on port 8088; the dashboard's API runs over REST/JSON on port 8000. The dashboard polls (fetch() every 3000ms) rather than using WebSockets — a deliberate simplicity/robustness tradeoff, reasonable given FL updates arrive on a round-based cadence (tens of seconds), not sub-second.</w:t>
+              <w:t>Two separate connections run at the same time: the federated learning traffic uses gRPC (the fast, binary protocol Flower is built on) on port 8088, while the dashboard talks to its own backend using a normal REST API over HTTP on port 8000. The dashboard checks for new data every 3 seconds rather than keeping a permanent live connection open (like a WebSocket would) — simpler to build, and reliable enough since an FL round takes far longer than 3 seconds anyway.</w:t>
             </w:r>
           </w:p>
         </w:tc>

</xml_diff>